<commit_message>
done all tinggal nu year
</commit_message>
<xml_diff>
--- a/Todo 28042025/revision/Checklist.docx
+++ b/Todo 28042025/revision/Checklist.docx
@@ -725,6 +725,15 @@
             <w:pPr>
               <w:jc w:val="center"/>
             </w:pPr>
+            <w:r>
+              <w:t>as confirmed in the fiverr chat on chat on 03-06-2025</w:t>
+            </w:r>
+            <w:r>
+              <w:t xml:space="preserve"> 09:51 AM(My Localtime)</w:t>
+            </w:r>
+            <w:r>
+              <w:t xml:space="preserve"> we agreed according to the rules in the chat</w:t>
+            </w:r>
           </w:p>
         </w:tc>
       </w:tr>
@@ -779,6 +788,9 @@
             <w:pPr>
               <w:jc w:val="center"/>
             </w:pPr>
+            <w:r>
+              <w:t>DONE</w:t>
+            </w:r>
           </w:p>
         </w:tc>
       </w:tr>
@@ -1028,7 +1040,11 @@
               <w:jc w:val="center"/>
             </w:pPr>
             <w:r>
-              <w:t>We cannot transfer activities separately from grades because when we transfer activities to the target subject, a new unique ID is created for both the subject and the grades during the process. This happens in a looped operation. If we allow activities to be transferred independently, it could result in data inconsistencies between subjects and their related grades. To maintain data integrity, both activities and grades must be transferred together</w:t>
+              <w:t xml:space="preserve">We cannot transfer activities separately from grades because when we transfer activities to the target subject, a new unique ID is created for both the subject and the grades during the process. This happens in a looped operation. If we allow activities to be transferred independently, it could result in data inconsistencies between subjects and their related grades. To maintain data integrity, both activities and </w:t>
+            </w:r>
+            <w:r>
+              <w:lastRenderedPageBreak/>
+              <w:t>grades must be transferred together</w:t>
             </w:r>
           </w:p>
           <w:p>
@@ -1109,8 +1125,6 @@
             <w:r>
               <w:t>DONE</w:t>
             </w:r>
-            <w:bookmarkStart w:id="0" w:name="_GoBack"/>
-            <w:bookmarkEnd w:id="0"/>
           </w:p>
         </w:tc>
       </w:tr>
@@ -2157,22 +2171,27 @@
               <w:jc w:val="center"/>
             </w:pPr>
             <w:r>
-              <w:t>DONE(EXPENSION ARROW PLACE ON THE BOTTOM BECAUSE ITS BASED ON HTML RULES)</w:t>
-            </w:r>
-          </w:p>
-        </w:tc>
-      </w:tr>
-      <w:tr>
-        <w:tc>
-          <w:tcPr>
-            <w:tcW w:w="260" w:type="pct"/>
-            <w:vAlign w:val="center"/>
-          </w:tcPr>
-          <w:p>
-            <w:pPr>
-              <w:jc w:val="center"/>
-            </w:pPr>
-            <w:r>
+              <w:t xml:space="preserve">DONE(EXPENSION ARROW PLACE ON THE BOTTOM BECAUSE ITS </w:t>
+            </w:r>
+            <w:r>
+              <w:lastRenderedPageBreak/>
+              <w:t>BASED ON HTML RULES)</w:t>
+            </w:r>
+          </w:p>
+        </w:tc>
+      </w:tr>
+      <w:tr>
+        <w:tc>
+          <w:tcPr>
+            <w:tcW w:w="260" w:type="pct"/>
+            <w:vAlign w:val="center"/>
+          </w:tcPr>
+          <w:p>
+            <w:pPr>
+              <w:jc w:val="center"/>
+            </w:pPr>
+            <w:r>
+              <w:lastRenderedPageBreak/>
               <w:t>32</w:t>
             </w:r>
           </w:p>
@@ -2430,7 +2449,6 @@
               <w:jc w:val="center"/>
             </w:pPr>
             <w:r>
-              <w:lastRenderedPageBreak/>
               <w:t>36</w:t>
             </w:r>
           </w:p>
@@ -2875,6 +2893,74 @@
               </w:rPr>
               <w:t>Done you can open academic settings</w:t>
             </w:r>
+          </w:p>
+        </w:tc>
+      </w:tr>
+      <w:tr>
+        <w:tc>
+          <w:tcPr>
+            <w:tcW w:w="260" w:type="pct"/>
+            <w:vAlign w:val="center"/>
+          </w:tcPr>
+          <w:p>
+            <w:pPr>
+              <w:jc w:val="center"/>
+            </w:pPr>
+            <w:r>
+              <w:t>42.</w:t>
+            </w:r>
+          </w:p>
+        </w:tc>
+        <w:tc>
+          <w:tcPr>
+            <w:tcW w:w="440" w:type="pct"/>
+            <w:vAlign w:val="center"/>
+          </w:tcPr>
+          <w:p>
+            <w:pPr>
+              <w:jc w:val="center"/>
+            </w:pPr>
+            <w:r>
+              <w:t>X</w:t>
+            </w:r>
+          </w:p>
+        </w:tc>
+        <w:tc>
+          <w:tcPr>
+            <w:tcW w:w="3879" w:type="pct"/>
+            <w:shd w:val="clear" w:color="auto" w:fill="auto"/>
+            <w:vAlign w:val="center"/>
+          </w:tcPr>
+          <w:p>
+            <w:pPr>
+              <w:rPr>
+                <w:lang w:val="en-US"/>
+              </w:rPr>
+            </w:pPr>
+            <w:r>
+              <w:t xml:space="preserve">I just hope it continues in the same state, that they maintain the grades, </w:t>
+            </w:r>
+            <w:bookmarkStart w:id="0" w:name="_GoBack"/>
+            <w:bookmarkEnd w:id="0"/>
+            <w:r>
+              <w:t>attendance, and active courses—everything the same as it would in a normal month.</w:t>
+            </w:r>
+          </w:p>
+        </w:tc>
+        <w:tc>
+          <w:tcPr>
+            <w:tcW w:w="421" w:type="pct"/>
+            <w:shd w:val="clear" w:color="auto" w:fill="auto"/>
+            <w:vAlign w:val="center"/>
+          </w:tcPr>
+          <w:p>
+            <w:pPr>
+              <w:jc w:val="center"/>
+              <w:rPr>
+                <w:rFonts w:ascii="Calibri" w:hAnsi="Calibri" w:cs="Calibri"/>
+                <w:color w:val="000000"/>
+              </w:rPr>
+            </w:pPr>
           </w:p>
         </w:tc>
       </w:tr>

</xml_diff>